<commit_message>
Deploy updates: anon client seed, compact UI, pastel table headers.
</commit_message>
<xml_diff>
--- a/docs/preview/01_Dogovor_remont_preview.docx
+++ b/docs/preview/01_Dogovor_remont_preview.docx
@@ -2199,7 +2199,7 @@
               <w:bottom w:val="single" w:color="999999" w:sz="4"/>
               <w:right w:val="single" w:color="999999" w:sz="4"/>
             </w:tcBorders>
-            <w:shd w:fill="1A1A1A" w:val="clear"/>
+            <w:shd w:fill="B7D4B0" w:val="clear"/>
             <w:tcMar>
               <w:top w:type="dxa" w:w="60"/>
               <w:left w:type="dxa" w:w="80"/>
@@ -2216,7 +2216,7 @@
                 <w:rFonts w:ascii="Times New Roman" w:cs="Times New Roman" w:eastAsia="Times New Roman" w:hAnsi="Times New Roman"/>
                 <w:b/>
                 <w:bCs/>
-                <w:color w:val="FFFFFF"/>
+                <w:color w:val="1A1A1A"/>
                 <w:sz w:val="18"/>
                 <w:szCs w:val="18"/>
               </w:rPr>
@@ -2233,7 +2233,7 @@
               <w:bottom w:val="single" w:color="999999" w:sz="4"/>
               <w:right w:val="single" w:color="999999" w:sz="4"/>
             </w:tcBorders>
-            <w:shd w:fill="1A1A1A" w:val="clear"/>
+            <w:shd w:fill="B7D4B0" w:val="clear"/>
             <w:tcMar>
               <w:top w:type="dxa" w:w="60"/>
               <w:left w:type="dxa" w:w="80"/>
@@ -2250,7 +2250,7 @@
                 <w:rFonts w:ascii="Times New Roman" w:cs="Times New Roman" w:eastAsia="Times New Roman" w:hAnsi="Times New Roman"/>
                 <w:b/>
                 <w:bCs/>
-                <w:color w:val="FFFFFF"/>
+                <w:color w:val="1A1A1A"/>
                 <w:sz w:val="18"/>
                 <w:szCs w:val="18"/>
               </w:rPr>
@@ -2267,7 +2267,7 @@
               <w:bottom w:val="single" w:color="999999" w:sz="4"/>
               <w:right w:val="single" w:color="999999" w:sz="4"/>
             </w:tcBorders>
-            <w:shd w:fill="1A1A1A" w:val="clear"/>
+            <w:shd w:fill="B7D4B0" w:val="clear"/>
             <w:tcMar>
               <w:top w:type="dxa" w:w="60"/>
               <w:left w:type="dxa" w:w="80"/>
@@ -2284,7 +2284,7 @@
                 <w:rFonts w:ascii="Times New Roman" w:cs="Times New Roman" w:eastAsia="Times New Roman" w:hAnsi="Times New Roman"/>
                 <w:b/>
                 <w:bCs/>
-                <w:color w:val="FFFFFF"/>
+                <w:color w:val="1A1A1A"/>
                 <w:sz w:val="18"/>
                 <w:szCs w:val="18"/>
               </w:rPr>
@@ -2301,7 +2301,7 @@
               <w:bottom w:val="single" w:color="999999" w:sz="4"/>
               <w:right w:val="single" w:color="999999" w:sz="4"/>
             </w:tcBorders>
-            <w:shd w:fill="1A1A1A" w:val="clear"/>
+            <w:shd w:fill="B7D4B0" w:val="clear"/>
             <w:tcMar>
               <w:top w:type="dxa" w:w="60"/>
               <w:left w:type="dxa" w:w="80"/>
@@ -2318,7 +2318,7 @@
                 <w:rFonts w:ascii="Times New Roman" w:cs="Times New Roman" w:eastAsia="Times New Roman" w:hAnsi="Times New Roman"/>
                 <w:b/>
                 <w:bCs/>
-                <w:color w:val="FFFFFF"/>
+                <w:color w:val="1A1A1A"/>
                 <w:sz w:val="18"/>
                 <w:szCs w:val="18"/>
               </w:rPr>
@@ -2335,7 +2335,7 @@
               <w:bottom w:val="single" w:color="999999" w:sz="4"/>
               <w:right w:val="single" w:color="999999" w:sz="4"/>
             </w:tcBorders>
-            <w:shd w:fill="1A1A1A" w:val="clear"/>
+            <w:shd w:fill="B7D4B0" w:val="clear"/>
             <w:tcMar>
               <w:top w:type="dxa" w:w="60"/>
               <w:left w:type="dxa" w:w="80"/>
@@ -2352,7 +2352,7 @@
                 <w:rFonts w:ascii="Times New Roman" w:cs="Times New Roman" w:eastAsia="Times New Roman" w:hAnsi="Times New Roman"/>
                 <w:b/>
                 <w:bCs/>
-                <w:color w:val="FFFFFF"/>
+                <w:color w:val="1A1A1A"/>
                 <w:sz w:val="18"/>
                 <w:szCs w:val="18"/>
               </w:rPr>
@@ -2369,7 +2369,7 @@
               <w:bottom w:val="single" w:color="999999" w:sz="4"/>
               <w:right w:val="single" w:color="999999" w:sz="4"/>
             </w:tcBorders>
-            <w:shd w:fill="1A1A1A" w:val="clear"/>
+            <w:shd w:fill="B7D4B0" w:val="clear"/>
             <w:tcMar>
               <w:top w:type="dxa" w:w="60"/>
               <w:left w:type="dxa" w:w="80"/>
@@ -2386,7 +2386,7 @@
                 <w:rFonts w:ascii="Times New Roman" w:cs="Times New Roman" w:eastAsia="Times New Roman" w:hAnsi="Times New Roman"/>
                 <w:b/>
                 <w:bCs/>
-                <w:color w:val="FFFFFF"/>
+                <w:color w:val="1A1A1A"/>
                 <w:sz w:val="18"/>
                 <w:szCs w:val="18"/>
               </w:rPr>
@@ -2589,7 +2589,7 @@
               <w:bottom w:val="single" w:color="999999" w:sz="4"/>
               <w:right w:val="single" w:color="999999" w:sz="4"/>
             </w:tcBorders>
-            <w:shd w:fill="FFF5F5" w:val="clear"/>
+            <w:shd w:fill="F5F5F5" w:val="clear"/>
             <w:tcMar>
               <w:top w:type="dxa" w:w="60"/>
               <w:left w:type="dxa" w:w="80"/>
@@ -2620,7 +2620,7 @@
               <w:bottom w:val="single" w:color="999999" w:sz="4"/>
               <w:right w:val="single" w:color="999999" w:sz="4"/>
             </w:tcBorders>
-            <w:shd w:fill="FFF5F5" w:val="clear"/>
+            <w:shd w:fill="F5F5F5" w:val="clear"/>
             <w:tcMar>
               <w:top w:type="dxa" w:w="60"/>
               <w:left w:type="dxa" w:w="80"/>
@@ -2651,7 +2651,7 @@
               <w:bottom w:val="single" w:color="999999" w:sz="4"/>
               <w:right w:val="single" w:color="999999" w:sz="4"/>
             </w:tcBorders>
-            <w:shd w:fill="FFF5F5" w:val="clear"/>
+            <w:shd w:fill="F5F5F5" w:val="clear"/>
             <w:tcMar>
               <w:top w:type="dxa" w:w="60"/>
               <w:left w:type="dxa" w:w="80"/>
@@ -2682,7 +2682,7 @@
               <w:bottom w:val="single" w:color="999999" w:sz="4"/>
               <w:right w:val="single" w:color="999999" w:sz="4"/>
             </w:tcBorders>
-            <w:shd w:fill="FFF5F5" w:val="clear"/>
+            <w:shd w:fill="F5F5F5" w:val="clear"/>
             <w:tcMar>
               <w:top w:type="dxa" w:w="60"/>
               <w:left w:type="dxa" w:w="80"/>
@@ -2713,7 +2713,7 @@
               <w:bottom w:val="single" w:color="999999" w:sz="4"/>
               <w:right w:val="single" w:color="999999" w:sz="4"/>
             </w:tcBorders>
-            <w:shd w:fill="FFF5F5" w:val="clear"/>
+            <w:shd w:fill="F5F5F5" w:val="clear"/>
             <w:tcMar>
               <w:top w:type="dxa" w:w="60"/>
               <w:left w:type="dxa" w:w="80"/>
@@ -2744,7 +2744,7 @@
               <w:bottom w:val="single" w:color="999999" w:sz="4"/>
               <w:right w:val="single" w:color="999999" w:sz="4"/>
             </w:tcBorders>
-            <w:shd w:fill="FFF5F5" w:val="clear"/>
+            <w:shd w:fill="F5F5F5" w:val="clear"/>
             <w:tcMar>
               <w:top w:type="dxa" w:w="60"/>
               <w:left w:type="dxa" w:w="80"/>

</xml_diff>

<commit_message>
Use polished generateDocs for contract autofill and ship to Pages.
</commit_message>
<xml_diff>
--- a/docs/preview/01_Dogovor_remont_preview.docx
+++ b/docs/preview/01_Dogovor_remont_preview.docx
@@ -767,12 +767,12 @@
             <w:tcW w:type="dxa" w:w="10206"/>
             <w:gridSpan w:val="2"/>
             <w:tcBorders>
-              <w:top w:val="single" w:color="1A1A1A" w:sz="8"/>
-              <w:left w:val="single" w:color="1A1A1A" w:sz="8"/>
-              <w:bottom w:val="single" w:color="1A1A1A" w:sz="8"/>
-              <w:right w:val="single" w:color="1A1A1A" w:sz="8"/>
-            </w:tcBorders>
-            <w:shd w:fill="C00000" w:val="clear"/>
+              <w:top w:val="single" w:color="AAAAAA" w:sz="4"/>
+              <w:left w:val="single" w:color="AAAAAA" w:sz="4"/>
+              <w:bottom w:val="single" w:color="AAAAAA" w:sz="4"/>
+              <w:right w:val="single" w:color="AAAAAA" w:sz="4"/>
+            </w:tcBorders>
+            <w:shd w:fill="F8FCF6" w:val="clear"/>
             <w:tcMar>
               <w:top w:type="dxa" w:w="70"/>
               <w:left w:type="dxa" w:w="100"/>
@@ -786,7 +786,7 @@
                 <w:rFonts w:ascii="Times New Roman" w:cs="Times New Roman" w:eastAsia="Times New Roman" w:hAnsi="Times New Roman"/>
                 <w:b/>
                 <w:bCs/>
-                <w:color w:val="FFFFFF"/>
+                <w:color w:val="1A1A1A"/>
                 <w:sz w:val="20"/>
                 <w:szCs w:val="20"/>
               </w:rPr>
@@ -800,12 +800,12 @@
           <w:tcPr>
             <w:tcW w:type="dxa" w:w="2800"/>
             <w:tcBorders>
-              <w:top w:val="single" w:color="999999" w:sz="4"/>
-              <w:left w:val="single" w:color="999999" w:sz="4"/>
-              <w:bottom w:val="single" w:color="999999" w:sz="4"/>
-              <w:right w:val="single" w:color="999999" w:sz="4"/>
-            </w:tcBorders>
-            <w:shd w:fill="F5F5F5" w:val="clear"/>
+              <w:top w:val="single" w:color="AAAAAA" w:sz="4"/>
+              <w:left w:val="single" w:color="AAAAAA" w:sz="4"/>
+              <w:bottom w:val="single" w:color="AAAAAA" w:sz="4"/>
+              <w:right w:val="single" w:color="AAAAAA" w:sz="4"/>
+            </w:tcBorders>
+            <w:shd w:fill="F7F7F7" w:val="clear"/>
             <w:tcMar>
               <w:top w:type="dxa" w:w="50"/>
               <w:left w:type="dxa" w:w="80"/>
@@ -831,10 +831,10 @@
           <w:tcPr>
             <w:tcW w:type="dxa" w:w="7406"/>
             <w:tcBorders>
-              <w:top w:val="single" w:color="999999" w:sz="4"/>
-              <w:left w:val="single" w:color="999999" w:sz="4"/>
-              <w:bottom w:val="single" w:color="999999" w:sz="4"/>
-              <w:right w:val="single" w:color="999999" w:sz="4"/>
+              <w:top w:val="single" w:color="AAAAAA" w:sz="4"/>
+              <w:left w:val="single" w:color="AAAAAA" w:sz="4"/>
+              <w:bottom w:val="single" w:color="AAAAAA" w:sz="4"/>
+              <w:right w:val="single" w:color="AAAAAA" w:sz="4"/>
             </w:tcBorders>
             <w:tcMar>
               <w:top w:type="dxa" w:w="50"/>
@@ -860,12 +860,12 @@
           <w:tcPr>
             <w:tcW w:type="dxa" w:w="2800"/>
             <w:tcBorders>
-              <w:top w:val="single" w:color="999999" w:sz="4"/>
-              <w:left w:val="single" w:color="999999" w:sz="4"/>
-              <w:bottom w:val="single" w:color="999999" w:sz="4"/>
-              <w:right w:val="single" w:color="999999" w:sz="4"/>
-            </w:tcBorders>
-            <w:shd w:fill="F5F5F5" w:val="clear"/>
+              <w:top w:val="single" w:color="AAAAAA" w:sz="4"/>
+              <w:left w:val="single" w:color="AAAAAA" w:sz="4"/>
+              <w:bottom w:val="single" w:color="AAAAAA" w:sz="4"/>
+              <w:right w:val="single" w:color="AAAAAA" w:sz="4"/>
+            </w:tcBorders>
+            <w:shd w:fill="F7F7F7" w:val="clear"/>
             <w:tcMar>
               <w:top w:type="dxa" w:w="50"/>
               <w:left w:type="dxa" w:w="80"/>
@@ -891,10 +891,10 @@
           <w:tcPr>
             <w:tcW w:type="dxa" w:w="7406"/>
             <w:tcBorders>
-              <w:top w:val="single" w:color="999999" w:sz="4"/>
-              <w:left w:val="single" w:color="999999" w:sz="4"/>
-              <w:bottom w:val="single" w:color="999999" w:sz="4"/>
-              <w:right w:val="single" w:color="999999" w:sz="4"/>
+              <w:top w:val="single" w:color="AAAAAA" w:sz="4"/>
+              <w:left w:val="single" w:color="AAAAAA" w:sz="4"/>
+              <w:bottom w:val="single" w:color="AAAAAA" w:sz="4"/>
+              <w:right w:val="single" w:color="AAAAAA" w:sz="4"/>
             </w:tcBorders>
             <w:tcMar>
               <w:top w:type="dxa" w:w="50"/>
@@ -920,12 +920,12 @@
           <w:tcPr>
             <w:tcW w:type="dxa" w:w="2800"/>
             <w:tcBorders>
-              <w:top w:val="single" w:color="999999" w:sz="4"/>
-              <w:left w:val="single" w:color="999999" w:sz="4"/>
-              <w:bottom w:val="single" w:color="999999" w:sz="4"/>
-              <w:right w:val="single" w:color="999999" w:sz="4"/>
-            </w:tcBorders>
-            <w:shd w:fill="F5F5F5" w:val="clear"/>
+              <w:top w:val="single" w:color="AAAAAA" w:sz="4"/>
+              <w:left w:val="single" w:color="AAAAAA" w:sz="4"/>
+              <w:bottom w:val="single" w:color="AAAAAA" w:sz="4"/>
+              <w:right w:val="single" w:color="AAAAAA" w:sz="4"/>
+            </w:tcBorders>
+            <w:shd w:fill="F7F7F7" w:val="clear"/>
             <w:tcMar>
               <w:top w:type="dxa" w:w="50"/>
               <w:left w:type="dxa" w:w="80"/>
@@ -951,10 +951,10 @@
           <w:tcPr>
             <w:tcW w:type="dxa" w:w="7406"/>
             <w:tcBorders>
-              <w:top w:val="single" w:color="999999" w:sz="4"/>
-              <w:left w:val="single" w:color="999999" w:sz="4"/>
-              <w:bottom w:val="single" w:color="999999" w:sz="4"/>
-              <w:right w:val="single" w:color="999999" w:sz="4"/>
+              <w:top w:val="single" w:color="AAAAAA" w:sz="4"/>
+              <w:left w:val="single" w:color="AAAAAA" w:sz="4"/>
+              <w:bottom w:val="single" w:color="AAAAAA" w:sz="4"/>
+              <w:right w:val="single" w:color="AAAAAA" w:sz="4"/>
             </w:tcBorders>
             <w:tcMar>
               <w:top w:type="dxa" w:w="50"/>
@@ -980,12 +980,12 @@
           <w:tcPr>
             <w:tcW w:type="dxa" w:w="2800"/>
             <w:tcBorders>
-              <w:top w:val="single" w:color="999999" w:sz="4"/>
-              <w:left w:val="single" w:color="999999" w:sz="4"/>
-              <w:bottom w:val="single" w:color="999999" w:sz="4"/>
-              <w:right w:val="single" w:color="999999" w:sz="4"/>
-            </w:tcBorders>
-            <w:shd w:fill="F5F5F5" w:val="clear"/>
+              <w:top w:val="single" w:color="AAAAAA" w:sz="4"/>
+              <w:left w:val="single" w:color="AAAAAA" w:sz="4"/>
+              <w:bottom w:val="single" w:color="AAAAAA" w:sz="4"/>
+              <w:right w:val="single" w:color="AAAAAA" w:sz="4"/>
+            </w:tcBorders>
+            <w:shd w:fill="F7F7F7" w:val="clear"/>
             <w:tcMar>
               <w:top w:type="dxa" w:w="50"/>
               <w:left w:type="dxa" w:w="80"/>
@@ -1011,10 +1011,10 @@
           <w:tcPr>
             <w:tcW w:type="dxa" w:w="7406"/>
             <w:tcBorders>
-              <w:top w:val="single" w:color="999999" w:sz="4"/>
-              <w:left w:val="single" w:color="999999" w:sz="4"/>
-              <w:bottom w:val="single" w:color="999999" w:sz="4"/>
-              <w:right w:val="single" w:color="999999" w:sz="4"/>
+              <w:top w:val="single" w:color="AAAAAA" w:sz="4"/>
+              <w:left w:val="single" w:color="AAAAAA" w:sz="4"/>
+              <w:bottom w:val="single" w:color="AAAAAA" w:sz="4"/>
+              <w:right w:val="single" w:color="AAAAAA" w:sz="4"/>
             </w:tcBorders>
             <w:tcMar>
               <w:top w:type="dxa" w:w="50"/>
@@ -1040,12 +1040,12 @@
           <w:tcPr>
             <w:tcW w:type="dxa" w:w="2800"/>
             <w:tcBorders>
-              <w:top w:val="single" w:color="999999" w:sz="4"/>
-              <w:left w:val="single" w:color="999999" w:sz="4"/>
-              <w:bottom w:val="single" w:color="999999" w:sz="4"/>
-              <w:right w:val="single" w:color="999999" w:sz="4"/>
-            </w:tcBorders>
-            <w:shd w:fill="F5F5F5" w:val="clear"/>
+              <w:top w:val="single" w:color="AAAAAA" w:sz="4"/>
+              <w:left w:val="single" w:color="AAAAAA" w:sz="4"/>
+              <w:bottom w:val="single" w:color="AAAAAA" w:sz="4"/>
+              <w:right w:val="single" w:color="AAAAAA" w:sz="4"/>
+            </w:tcBorders>
+            <w:shd w:fill="F7F7F7" w:val="clear"/>
             <w:tcMar>
               <w:top w:type="dxa" w:w="50"/>
               <w:left w:type="dxa" w:w="80"/>
@@ -1071,10 +1071,10 @@
           <w:tcPr>
             <w:tcW w:type="dxa" w:w="7406"/>
             <w:tcBorders>
-              <w:top w:val="single" w:color="999999" w:sz="4"/>
-              <w:left w:val="single" w:color="999999" w:sz="4"/>
-              <w:bottom w:val="single" w:color="999999" w:sz="4"/>
-              <w:right w:val="single" w:color="999999" w:sz="4"/>
+              <w:top w:val="single" w:color="AAAAAA" w:sz="4"/>
+              <w:left w:val="single" w:color="AAAAAA" w:sz="4"/>
+              <w:bottom w:val="single" w:color="AAAAAA" w:sz="4"/>
+              <w:right w:val="single" w:color="AAAAAA" w:sz="4"/>
             </w:tcBorders>
             <w:tcMar>
               <w:top w:type="dxa" w:w="50"/>
@@ -1100,12 +1100,12 @@
           <w:tcPr>
             <w:tcW w:type="dxa" w:w="2800"/>
             <w:tcBorders>
-              <w:top w:val="single" w:color="999999" w:sz="4"/>
-              <w:left w:val="single" w:color="999999" w:sz="4"/>
-              <w:bottom w:val="single" w:color="999999" w:sz="4"/>
-              <w:right w:val="single" w:color="999999" w:sz="4"/>
-            </w:tcBorders>
-            <w:shd w:fill="F5F5F5" w:val="clear"/>
+              <w:top w:val="single" w:color="AAAAAA" w:sz="4"/>
+              <w:left w:val="single" w:color="AAAAAA" w:sz="4"/>
+              <w:bottom w:val="single" w:color="AAAAAA" w:sz="4"/>
+              <w:right w:val="single" w:color="AAAAAA" w:sz="4"/>
+            </w:tcBorders>
+            <w:shd w:fill="F7F7F7" w:val="clear"/>
             <w:tcMar>
               <w:top w:type="dxa" w:w="50"/>
               <w:left w:type="dxa" w:w="80"/>
@@ -1131,10 +1131,10 @@
           <w:tcPr>
             <w:tcW w:type="dxa" w:w="7406"/>
             <w:tcBorders>
-              <w:top w:val="single" w:color="999999" w:sz="4"/>
-              <w:left w:val="single" w:color="999999" w:sz="4"/>
-              <w:bottom w:val="single" w:color="999999" w:sz="4"/>
-              <w:right w:val="single" w:color="999999" w:sz="4"/>
+              <w:top w:val="single" w:color="AAAAAA" w:sz="4"/>
+              <w:left w:val="single" w:color="AAAAAA" w:sz="4"/>
+              <w:bottom w:val="single" w:color="AAAAAA" w:sz="4"/>
+              <w:right w:val="single" w:color="AAAAAA" w:sz="4"/>
             </w:tcBorders>
             <w:tcMar>
               <w:top w:type="dxa" w:w="50"/>
@@ -1160,12 +1160,12 @@
           <w:tcPr>
             <w:tcW w:type="dxa" w:w="2800"/>
             <w:tcBorders>
-              <w:top w:val="single" w:color="999999" w:sz="4"/>
-              <w:left w:val="single" w:color="999999" w:sz="4"/>
-              <w:bottom w:val="single" w:color="999999" w:sz="4"/>
-              <w:right w:val="single" w:color="999999" w:sz="4"/>
-            </w:tcBorders>
-            <w:shd w:fill="F5F5F5" w:val="clear"/>
+              <w:top w:val="single" w:color="AAAAAA" w:sz="4"/>
+              <w:left w:val="single" w:color="AAAAAA" w:sz="4"/>
+              <w:bottom w:val="single" w:color="AAAAAA" w:sz="4"/>
+              <w:right w:val="single" w:color="AAAAAA" w:sz="4"/>
+            </w:tcBorders>
+            <w:shd w:fill="F7F7F7" w:val="clear"/>
             <w:tcMar>
               <w:top w:type="dxa" w:w="50"/>
               <w:left w:type="dxa" w:w="80"/>
@@ -1191,10 +1191,10 @@
           <w:tcPr>
             <w:tcW w:type="dxa" w:w="7406"/>
             <w:tcBorders>
-              <w:top w:val="single" w:color="999999" w:sz="4"/>
-              <w:left w:val="single" w:color="999999" w:sz="4"/>
-              <w:bottom w:val="single" w:color="999999" w:sz="4"/>
-              <w:right w:val="single" w:color="999999" w:sz="4"/>
+              <w:top w:val="single" w:color="AAAAAA" w:sz="4"/>
+              <w:left w:val="single" w:color="AAAAAA" w:sz="4"/>
+              <w:bottom w:val="single" w:color="AAAAAA" w:sz="4"/>
+              <w:right w:val="single" w:color="AAAAAA" w:sz="4"/>
             </w:tcBorders>
             <w:tcMar>
               <w:top w:type="dxa" w:w="50"/>
@@ -1220,12 +1220,12 @@
           <w:tcPr>
             <w:tcW w:type="dxa" w:w="2800"/>
             <w:tcBorders>
-              <w:top w:val="single" w:color="999999" w:sz="4"/>
-              <w:left w:val="single" w:color="999999" w:sz="4"/>
-              <w:bottom w:val="single" w:color="999999" w:sz="4"/>
-              <w:right w:val="single" w:color="999999" w:sz="4"/>
-            </w:tcBorders>
-            <w:shd w:fill="F5F5F5" w:val="clear"/>
+              <w:top w:val="single" w:color="AAAAAA" w:sz="4"/>
+              <w:left w:val="single" w:color="AAAAAA" w:sz="4"/>
+              <w:bottom w:val="single" w:color="AAAAAA" w:sz="4"/>
+              <w:right w:val="single" w:color="AAAAAA" w:sz="4"/>
+            </w:tcBorders>
+            <w:shd w:fill="F7F7F7" w:val="clear"/>
             <w:tcMar>
               <w:top w:type="dxa" w:w="50"/>
               <w:left w:type="dxa" w:w="80"/>
@@ -1251,10 +1251,10 @@
           <w:tcPr>
             <w:tcW w:type="dxa" w:w="7406"/>
             <w:tcBorders>
-              <w:top w:val="single" w:color="999999" w:sz="4"/>
-              <w:left w:val="single" w:color="999999" w:sz="4"/>
-              <w:bottom w:val="single" w:color="999999" w:sz="4"/>
-              <w:right w:val="single" w:color="999999" w:sz="4"/>
+              <w:top w:val="single" w:color="AAAAAA" w:sz="4"/>
+              <w:left w:val="single" w:color="AAAAAA" w:sz="4"/>
+              <w:bottom w:val="single" w:color="AAAAAA" w:sz="4"/>
+              <w:right w:val="single" w:color="AAAAAA" w:sz="4"/>
             </w:tcBorders>
             <w:tcMar>
               <w:top w:type="dxa" w:w="50"/>
@@ -1441,12 +1441,12 @@
             <w:tcW w:type="dxa" w:w="10206"/>
             <w:gridSpan w:val="2"/>
             <w:tcBorders>
-              <w:top w:val="single" w:color="1A1A1A" w:sz="8"/>
-              <w:left w:val="single" w:color="1A1A1A" w:sz="8"/>
-              <w:bottom w:val="single" w:color="1A1A1A" w:sz="8"/>
-              <w:right w:val="single" w:color="1A1A1A" w:sz="8"/>
-            </w:tcBorders>
-            <w:shd w:fill="C00000" w:val="clear"/>
+              <w:top w:val="single" w:color="AAAAAA" w:sz="4"/>
+              <w:left w:val="single" w:color="AAAAAA" w:sz="4"/>
+              <w:bottom w:val="single" w:color="AAAAAA" w:sz="4"/>
+              <w:right w:val="single" w:color="AAAAAA" w:sz="4"/>
+            </w:tcBorders>
+            <w:shd w:fill="F8FCF6" w:val="clear"/>
             <w:tcMar>
               <w:top w:type="dxa" w:w="70"/>
               <w:left w:type="dxa" w:w="100"/>
@@ -1460,7 +1460,7 @@
                 <w:rFonts w:ascii="Times New Roman" w:cs="Times New Roman" w:eastAsia="Times New Roman" w:hAnsi="Times New Roman"/>
                 <w:b/>
                 <w:bCs/>
-                <w:color w:val="FFFFFF"/>
+                <w:color w:val="1A1A1A"/>
                 <w:sz w:val="20"/>
                 <w:szCs w:val="20"/>
               </w:rPr>
@@ -1474,12 +1474,12 @@
           <w:tcPr>
             <w:tcW w:type="dxa" w:w="2800"/>
             <w:tcBorders>
-              <w:top w:val="single" w:color="999999" w:sz="4"/>
-              <w:left w:val="single" w:color="999999" w:sz="4"/>
-              <w:bottom w:val="single" w:color="999999" w:sz="4"/>
-              <w:right w:val="single" w:color="999999" w:sz="4"/>
-            </w:tcBorders>
-            <w:shd w:fill="F5F5F5" w:val="clear"/>
+              <w:top w:val="single" w:color="AAAAAA" w:sz="4"/>
+              <w:left w:val="single" w:color="AAAAAA" w:sz="4"/>
+              <w:bottom w:val="single" w:color="AAAAAA" w:sz="4"/>
+              <w:right w:val="single" w:color="AAAAAA" w:sz="4"/>
+            </w:tcBorders>
+            <w:shd w:fill="F7F7F7" w:val="clear"/>
             <w:tcMar>
               <w:top w:type="dxa" w:w="50"/>
               <w:left w:type="dxa" w:w="80"/>
@@ -1505,10 +1505,10 @@
           <w:tcPr>
             <w:tcW w:type="dxa" w:w="7406"/>
             <w:tcBorders>
-              <w:top w:val="single" w:color="999999" w:sz="4"/>
-              <w:left w:val="single" w:color="999999" w:sz="4"/>
-              <w:bottom w:val="single" w:color="999999" w:sz="4"/>
-              <w:right w:val="single" w:color="999999" w:sz="4"/>
+              <w:top w:val="single" w:color="AAAAAA" w:sz="4"/>
+              <w:left w:val="single" w:color="AAAAAA" w:sz="4"/>
+              <w:bottom w:val="single" w:color="AAAAAA" w:sz="4"/>
+              <w:right w:val="single" w:color="AAAAAA" w:sz="4"/>
             </w:tcBorders>
             <w:tcMar>
               <w:top w:type="dxa" w:w="50"/>
@@ -1534,12 +1534,12 @@
           <w:tcPr>
             <w:tcW w:type="dxa" w:w="2800"/>
             <w:tcBorders>
-              <w:top w:val="single" w:color="999999" w:sz="4"/>
-              <w:left w:val="single" w:color="999999" w:sz="4"/>
-              <w:bottom w:val="single" w:color="999999" w:sz="4"/>
-              <w:right w:val="single" w:color="999999" w:sz="4"/>
-            </w:tcBorders>
-            <w:shd w:fill="F5F5F5" w:val="clear"/>
+              <w:top w:val="single" w:color="AAAAAA" w:sz="4"/>
+              <w:left w:val="single" w:color="AAAAAA" w:sz="4"/>
+              <w:bottom w:val="single" w:color="AAAAAA" w:sz="4"/>
+              <w:right w:val="single" w:color="AAAAAA" w:sz="4"/>
+            </w:tcBorders>
+            <w:shd w:fill="F7F7F7" w:val="clear"/>
             <w:tcMar>
               <w:top w:type="dxa" w:w="50"/>
               <w:left w:type="dxa" w:w="80"/>
@@ -1565,10 +1565,10 @@
           <w:tcPr>
             <w:tcW w:type="dxa" w:w="7406"/>
             <w:tcBorders>
-              <w:top w:val="single" w:color="999999" w:sz="4"/>
-              <w:left w:val="single" w:color="999999" w:sz="4"/>
-              <w:bottom w:val="single" w:color="999999" w:sz="4"/>
-              <w:right w:val="single" w:color="999999" w:sz="4"/>
+              <w:top w:val="single" w:color="AAAAAA" w:sz="4"/>
+              <w:left w:val="single" w:color="AAAAAA" w:sz="4"/>
+              <w:bottom w:val="single" w:color="AAAAAA" w:sz="4"/>
+              <w:right w:val="single" w:color="AAAAAA" w:sz="4"/>
             </w:tcBorders>
             <w:tcMar>
               <w:top w:type="dxa" w:w="50"/>
@@ -1594,12 +1594,12 @@
           <w:tcPr>
             <w:tcW w:type="dxa" w:w="2800"/>
             <w:tcBorders>
-              <w:top w:val="single" w:color="999999" w:sz="4"/>
-              <w:left w:val="single" w:color="999999" w:sz="4"/>
-              <w:bottom w:val="single" w:color="999999" w:sz="4"/>
-              <w:right w:val="single" w:color="999999" w:sz="4"/>
-            </w:tcBorders>
-            <w:shd w:fill="F5F5F5" w:val="clear"/>
+              <w:top w:val="single" w:color="AAAAAA" w:sz="4"/>
+              <w:left w:val="single" w:color="AAAAAA" w:sz="4"/>
+              <w:bottom w:val="single" w:color="AAAAAA" w:sz="4"/>
+              <w:right w:val="single" w:color="AAAAAA" w:sz="4"/>
+            </w:tcBorders>
+            <w:shd w:fill="F7F7F7" w:val="clear"/>
             <w:tcMar>
               <w:top w:type="dxa" w:w="50"/>
               <w:left w:type="dxa" w:w="80"/>
@@ -1625,10 +1625,10 @@
           <w:tcPr>
             <w:tcW w:type="dxa" w:w="7406"/>
             <w:tcBorders>
-              <w:top w:val="single" w:color="999999" w:sz="4"/>
-              <w:left w:val="single" w:color="999999" w:sz="4"/>
-              <w:bottom w:val="single" w:color="999999" w:sz="4"/>
-              <w:right w:val="single" w:color="999999" w:sz="4"/>
+              <w:top w:val="single" w:color="AAAAAA" w:sz="4"/>
+              <w:left w:val="single" w:color="AAAAAA" w:sz="4"/>
+              <w:bottom w:val="single" w:color="AAAAAA" w:sz="4"/>
+              <w:right w:val="single" w:color="AAAAAA" w:sz="4"/>
             </w:tcBorders>
             <w:tcMar>
               <w:top w:type="dxa" w:w="50"/>
@@ -1654,12 +1654,12 @@
           <w:tcPr>
             <w:tcW w:type="dxa" w:w="2800"/>
             <w:tcBorders>
-              <w:top w:val="single" w:color="999999" w:sz="4"/>
-              <w:left w:val="single" w:color="999999" w:sz="4"/>
-              <w:bottom w:val="single" w:color="999999" w:sz="4"/>
-              <w:right w:val="single" w:color="999999" w:sz="4"/>
-            </w:tcBorders>
-            <w:shd w:fill="F5F5F5" w:val="clear"/>
+              <w:top w:val="single" w:color="AAAAAA" w:sz="4"/>
+              <w:left w:val="single" w:color="AAAAAA" w:sz="4"/>
+              <w:bottom w:val="single" w:color="AAAAAA" w:sz="4"/>
+              <w:right w:val="single" w:color="AAAAAA" w:sz="4"/>
+            </w:tcBorders>
+            <w:shd w:fill="F7F7F7" w:val="clear"/>
             <w:tcMar>
               <w:top w:type="dxa" w:w="50"/>
               <w:left w:type="dxa" w:w="80"/>
@@ -1685,10 +1685,10 @@
           <w:tcPr>
             <w:tcW w:type="dxa" w:w="7406"/>
             <w:tcBorders>
-              <w:top w:val="single" w:color="999999" w:sz="4"/>
-              <w:left w:val="single" w:color="999999" w:sz="4"/>
-              <w:bottom w:val="single" w:color="999999" w:sz="4"/>
-              <w:right w:val="single" w:color="999999" w:sz="4"/>
+              <w:top w:val="single" w:color="AAAAAA" w:sz="4"/>
+              <w:left w:val="single" w:color="AAAAAA" w:sz="4"/>
+              <w:bottom w:val="single" w:color="AAAAAA" w:sz="4"/>
+              <w:right w:val="single" w:color="AAAAAA" w:sz="4"/>
             </w:tcBorders>
             <w:tcMar>
               <w:top w:type="dxa" w:w="50"/>
@@ -1714,12 +1714,12 @@
           <w:tcPr>
             <w:tcW w:type="dxa" w:w="2800"/>
             <w:tcBorders>
-              <w:top w:val="single" w:color="999999" w:sz="4"/>
-              <w:left w:val="single" w:color="999999" w:sz="4"/>
-              <w:bottom w:val="single" w:color="999999" w:sz="4"/>
-              <w:right w:val="single" w:color="999999" w:sz="4"/>
-            </w:tcBorders>
-            <w:shd w:fill="F5F5F5" w:val="clear"/>
+              <w:top w:val="single" w:color="AAAAAA" w:sz="4"/>
+              <w:left w:val="single" w:color="AAAAAA" w:sz="4"/>
+              <w:bottom w:val="single" w:color="AAAAAA" w:sz="4"/>
+              <w:right w:val="single" w:color="AAAAAA" w:sz="4"/>
+            </w:tcBorders>
+            <w:shd w:fill="F7F7F7" w:val="clear"/>
             <w:tcMar>
               <w:top w:type="dxa" w:w="50"/>
               <w:left w:type="dxa" w:w="80"/>
@@ -1745,10 +1745,10 @@
           <w:tcPr>
             <w:tcW w:type="dxa" w:w="7406"/>
             <w:tcBorders>
-              <w:top w:val="single" w:color="999999" w:sz="4"/>
-              <w:left w:val="single" w:color="999999" w:sz="4"/>
-              <w:bottom w:val="single" w:color="999999" w:sz="4"/>
-              <w:right w:val="single" w:color="999999" w:sz="4"/>
+              <w:top w:val="single" w:color="AAAAAA" w:sz="4"/>
+              <w:left w:val="single" w:color="AAAAAA" w:sz="4"/>
+              <w:bottom w:val="single" w:color="AAAAAA" w:sz="4"/>
+              <w:right w:val="single" w:color="AAAAAA" w:sz="4"/>
             </w:tcBorders>
             <w:tcMar>
               <w:top w:type="dxa" w:w="50"/>
@@ -1774,12 +1774,12 @@
           <w:tcPr>
             <w:tcW w:type="dxa" w:w="2800"/>
             <w:tcBorders>
-              <w:top w:val="single" w:color="999999" w:sz="4"/>
-              <w:left w:val="single" w:color="999999" w:sz="4"/>
-              <w:bottom w:val="single" w:color="999999" w:sz="4"/>
-              <w:right w:val="single" w:color="999999" w:sz="4"/>
-            </w:tcBorders>
-            <w:shd w:fill="F5F5F5" w:val="clear"/>
+              <w:top w:val="single" w:color="AAAAAA" w:sz="4"/>
+              <w:left w:val="single" w:color="AAAAAA" w:sz="4"/>
+              <w:bottom w:val="single" w:color="AAAAAA" w:sz="4"/>
+              <w:right w:val="single" w:color="AAAAAA" w:sz="4"/>
+            </w:tcBorders>
+            <w:shd w:fill="F7F7F7" w:val="clear"/>
             <w:tcMar>
               <w:top w:type="dxa" w:w="50"/>
               <w:left w:type="dxa" w:w="80"/>
@@ -1805,10 +1805,10 @@
           <w:tcPr>
             <w:tcW w:type="dxa" w:w="7406"/>
             <w:tcBorders>
-              <w:top w:val="single" w:color="999999" w:sz="4"/>
-              <w:left w:val="single" w:color="999999" w:sz="4"/>
-              <w:bottom w:val="single" w:color="999999" w:sz="4"/>
-              <w:right w:val="single" w:color="999999" w:sz="4"/>
+              <w:top w:val="single" w:color="AAAAAA" w:sz="4"/>
+              <w:left w:val="single" w:color="AAAAAA" w:sz="4"/>
+              <w:bottom w:val="single" w:color="AAAAAA" w:sz="4"/>
+              <w:right w:val="single" w:color="AAAAAA" w:sz="4"/>
             </w:tcBorders>
             <w:tcMar>
               <w:top w:type="dxa" w:w="50"/>
@@ -1834,12 +1834,12 @@
           <w:tcPr>
             <w:tcW w:type="dxa" w:w="2800"/>
             <w:tcBorders>
-              <w:top w:val="single" w:color="999999" w:sz="4"/>
-              <w:left w:val="single" w:color="999999" w:sz="4"/>
-              <w:bottom w:val="single" w:color="999999" w:sz="4"/>
-              <w:right w:val="single" w:color="999999" w:sz="4"/>
-            </w:tcBorders>
-            <w:shd w:fill="F5F5F5" w:val="clear"/>
+              <w:top w:val="single" w:color="AAAAAA" w:sz="4"/>
+              <w:left w:val="single" w:color="AAAAAA" w:sz="4"/>
+              <w:bottom w:val="single" w:color="AAAAAA" w:sz="4"/>
+              <w:right w:val="single" w:color="AAAAAA" w:sz="4"/>
+            </w:tcBorders>
+            <w:shd w:fill="F7F7F7" w:val="clear"/>
             <w:tcMar>
               <w:top w:type="dxa" w:w="50"/>
               <w:left w:type="dxa" w:w="80"/>
@@ -1865,10 +1865,10 @@
           <w:tcPr>
             <w:tcW w:type="dxa" w:w="7406"/>
             <w:tcBorders>
-              <w:top w:val="single" w:color="999999" w:sz="4"/>
-              <w:left w:val="single" w:color="999999" w:sz="4"/>
-              <w:bottom w:val="single" w:color="999999" w:sz="4"/>
-              <w:right w:val="single" w:color="999999" w:sz="4"/>
+              <w:top w:val="single" w:color="AAAAAA" w:sz="4"/>
+              <w:left w:val="single" w:color="AAAAAA" w:sz="4"/>
+              <w:bottom w:val="single" w:color="AAAAAA" w:sz="4"/>
+              <w:right w:val="single" w:color="AAAAAA" w:sz="4"/>
             </w:tcBorders>
             <w:tcMar>
               <w:top w:type="dxa" w:w="50"/>
@@ -1894,12 +1894,12 @@
           <w:tcPr>
             <w:tcW w:type="dxa" w:w="2800"/>
             <w:tcBorders>
-              <w:top w:val="single" w:color="999999" w:sz="4"/>
-              <w:left w:val="single" w:color="999999" w:sz="4"/>
-              <w:bottom w:val="single" w:color="999999" w:sz="4"/>
-              <w:right w:val="single" w:color="999999" w:sz="4"/>
-            </w:tcBorders>
-            <w:shd w:fill="F5F5F5" w:val="clear"/>
+              <w:top w:val="single" w:color="AAAAAA" w:sz="4"/>
+              <w:left w:val="single" w:color="AAAAAA" w:sz="4"/>
+              <w:bottom w:val="single" w:color="AAAAAA" w:sz="4"/>
+              <w:right w:val="single" w:color="AAAAAA" w:sz="4"/>
+            </w:tcBorders>
+            <w:shd w:fill="F7F7F7" w:val="clear"/>
             <w:tcMar>
               <w:top w:type="dxa" w:w="50"/>
               <w:left w:type="dxa" w:w="80"/>
@@ -1925,10 +1925,10 @@
           <w:tcPr>
             <w:tcW w:type="dxa" w:w="7406"/>
             <w:tcBorders>
-              <w:top w:val="single" w:color="999999" w:sz="4"/>
-              <w:left w:val="single" w:color="999999" w:sz="4"/>
-              <w:bottom w:val="single" w:color="999999" w:sz="4"/>
-              <w:right w:val="single" w:color="999999" w:sz="4"/>
+              <w:top w:val="single" w:color="AAAAAA" w:sz="4"/>
+              <w:left w:val="single" w:color="AAAAAA" w:sz="4"/>
+              <w:bottom w:val="single" w:color="AAAAAA" w:sz="4"/>
+              <w:right w:val="single" w:color="AAAAAA" w:sz="4"/>
             </w:tcBorders>
             <w:tcMar>
               <w:top w:type="dxa" w:w="50"/>
@@ -2194,12 +2194,12 @@
           <w:tcPr>
             <w:tcW w:type="dxa" w:w="700"/>
             <w:tcBorders>
-              <w:top w:val="single" w:color="999999" w:sz="4"/>
-              <w:left w:val="single" w:color="999999" w:sz="4"/>
-              <w:bottom w:val="single" w:color="999999" w:sz="4"/>
-              <w:right w:val="single" w:color="999999" w:sz="4"/>
-            </w:tcBorders>
-            <w:shd w:fill="B7D4B0" w:val="clear"/>
+              <w:top w:val="single" w:color="AAAAAA" w:sz="4"/>
+              <w:left w:val="single" w:color="AAAAAA" w:sz="4"/>
+              <w:bottom w:val="single" w:color="AAAAAA" w:sz="4"/>
+              <w:right w:val="single" w:color="AAAAAA" w:sz="4"/>
+            </w:tcBorders>
+            <w:shd w:fill="F8FCF6" w:val="clear"/>
             <w:tcMar>
               <w:top w:type="dxa" w:w="60"/>
               <w:left w:type="dxa" w:w="80"/>
@@ -2228,12 +2228,12 @@
           <w:tcPr>
             <w:tcW w:type="dxa" w:w="3800"/>
             <w:tcBorders>
-              <w:top w:val="single" w:color="999999" w:sz="4"/>
-              <w:left w:val="single" w:color="999999" w:sz="4"/>
-              <w:bottom w:val="single" w:color="999999" w:sz="4"/>
-              <w:right w:val="single" w:color="999999" w:sz="4"/>
-            </w:tcBorders>
-            <w:shd w:fill="B7D4B0" w:val="clear"/>
+              <w:top w:val="single" w:color="AAAAAA" w:sz="4"/>
+              <w:left w:val="single" w:color="AAAAAA" w:sz="4"/>
+              <w:bottom w:val="single" w:color="AAAAAA" w:sz="4"/>
+              <w:right w:val="single" w:color="AAAAAA" w:sz="4"/>
+            </w:tcBorders>
+            <w:shd w:fill="F8FCF6" w:val="clear"/>
             <w:tcMar>
               <w:top w:type="dxa" w:w="60"/>
               <w:left w:type="dxa" w:w="80"/>
@@ -2262,12 +2262,12 @@
           <w:tcPr>
             <w:tcW w:type="dxa" w:w="900"/>
             <w:tcBorders>
-              <w:top w:val="single" w:color="999999" w:sz="4"/>
-              <w:left w:val="single" w:color="999999" w:sz="4"/>
-              <w:bottom w:val="single" w:color="999999" w:sz="4"/>
-              <w:right w:val="single" w:color="999999" w:sz="4"/>
-            </w:tcBorders>
-            <w:shd w:fill="B7D4B0" w:val="clear"/>
+              <w:top w:val="single" w:color="AAAAAA" w:sz="4"/>
+              <w:left w:val="single" w:color="AAAAAA" w:sz="4"/>
+              <w:bottom w:val="single" w:color="AAAAAA" w:sz="4"/>
+              <w:right w:val="single" w:color="AAAAAA" w:sz="4"/>
+            </w:tcBorders>
+            <w:shd w:fill="F8FCF6" w:val="clear"/>
             <w:tcMar>
               <w:top w:type="dxa" w:w="60"/>
               <w:left w:type="dxa" w:w="80"/>
@@ -2296,12 +2296,12 @@
           <w:tcPr>
             <w:tcW w:type="dxa" w:w="900"/>
             <w:tcBorders>
-              <w:top w:val="single" w:color="999999" w:sz="4"/>
-              <w:left w:val="single" w:color="999999" w:sz="4"/>
-              <w:bottom w:val="single" w:color="999999" w:sz="4"/>
-              <w:right w:val="single" w:color="999999" w:sz="4"/>
-            </w:tcBorders>
-            <w:shd w:fill="B7D4B0" w:val="clear"/>
+              <w:top w:val="single" w:color="AAAAAA" w:sz="4"/>
+              <w:left w:val="single" w:color="AAAAAA" w:sz="4"/>
+              <w:bottom w:val="single" w:color="AAAAAA" w:sz="4"/>
+              <w:right w:val="single" w:color="AAAAAA" w:sz="4"/>
+            </w:tcBorders>
+            <w:shd w:fill="F8FCF6" w:val="clear"/>
             <w:tcMar>
               <w:top w:type="dxa" w:w="60"/>
               <w:left w:type="dxa" w:w="80"/>
@@ -2330,12 +2330,12 @@
           <w:tcPr>
             <w:tcW w:type="dxa" w:w="1400"/>
             <w:tcBorders>
-              <w:top w:val="single" w:color="999999" w:sz="4"/>
-              <w:left w:val="single" w:color="999999" w:sz="4"/>
-              <w:bottom w:val="single" w:color="999999" w:sz="4"/>
-              <w:right w:val="single" w:color="999999" w:sz="4"/>
-            </w:tcBorders>
-            <w:shd w:fill="B7D4B0" w:val="clear"/>
+              <w:top w:val="single" w:color="AAAAAA" w:sz="4"/>
+              <w:left w:val="single" w:color="AAAAAA" w:sz="4"/>
+              <w:bottom w:val="single" w:color="AAAAAA" w:sz="4"/>
+              <w:right w:val="single" w:color="AAAAAA" w:sz="4"/>
+            </w:tcBorders>
+            <w:shd w:fill="F8FCF6" w:val="clear"/>
             <w:tcMar>
               <w:top w:type="dxa" w:w="60"/>
               <w:left w:type="dxa" w:w="80"/>
@@ -2364,12 +2364,12 @@
           <w:tcPr>
             <w:tcW w:type="dxa" w:w="1600"/>
             <w:tcBorders>
-              <w:top w:val="single" w:color="999999" w:sz="4"/>
-              <w:left w:val="single" w:color="999999" w:sz="4"/>
-              <w:bottom w:val="single" w:color="999999" w:sz="4"/>
-              <w:right w:val="single" w:color="999999" w:sz="4"/>
-            </w:tcBorders>
-            <w:shd w:fill="B7D4B0" w:val="clear"/>
+              <w:top w:val="single" w:color="AAAAAA" w:sz="4"/>
+              <w:left w:val="single" w:color="AAAAAA" w:sz="4"/>
+              <w:bottom w:val="single" w:color="AAAAAA" w:sz="4"/>
+              <w:right w:val="single" w:color="AAAAAA" w:sz="4"/>
+            </w:tcBorders>
+            <w:shd w:fill="F8FCF6" w:val="clear"/>
             <w:tcMar>
               <w:top w:type="dxa" w:w="60"/>
               <w:left w:type="dxa" w:w="80"/>
@@ -2400,10 +2400,10 @@
           <w:tcPr>
             <w:tcW w:type="dxa" w:w="700"/>
             <w:tcBorders>
-              <w:top w:val="single" w:color="999999" w:sz="4"/>
-              <w:left w:val="single" w:color="999999" w:sz="4"/>
-              <w:bottom w:val="single" w:color="999999" w:sz="4"/>
-              <w:right w:val="single" w:color="999999" w:sz="4"/>
+              <w:top w:val="single" w:color="AAAAAA" w:sz="4"/>
+              <w:left w:val="single" w:color="AAAAAA" w:sz="4"/>
+              <w:bottom w:val="single" w:color="AAAAAA" w:sz="4"/>
+              <w:right w:val="single" w:color="AAAAAA" w:sz="4"/>
             </w:tcBorders>
             <w:tcMar>
               <w:top w:type="dxa" w:w="60"/>
@@ -2430,10 +2430,10 @@
           <w:tcPr>
             <w:tcW w:type="dxa" w:w="3800"/>
             <w:tcBorders>
-              <w:top w:val="single" w:color="999999" w:sz="4"/>
-              <w:left w:val="single" w:color="999999" w:sz="4"/>
-              <w:bottom w:val="single" w:color="999999" w:sz="4"/>
-              <w:right w:val="single" w:color="999999" w:sz="4"/>
+              <w:top w:val="single" w:color="AAAAAA" w:sz="4"/>
+              <w:left w:val="single" w:color="AAAAAA" w:sz="4"/>
+              <w:bottom w:val="single" w:color="AAAAAA" w:sz="4"/>
+              <w:right w:val="single" w:color="AAAAAA" w:sz="4"/>
             </w:tcBorders>
             <w:tcMar>
               <w:top w:type="dxa" w:w="60"/>
@@ -2460,10 +2460,10 @@
           <w:tcPr>
             <w:tcW w:type="dxa" w:w="900"/>
             <w:tcBorders>
-              <w:top w:val="single" w:color="999999" w:sz="4"/>
-              <w:left w:val="single" w:color="999999" w:sz="4"/>
-              <w:bottom w:val="single" w:color="999999" w:sz="4"/>
-              <w:right w:val="single" w:color="999999" w:sz="4"/>
+              <w:top w:val="single" w:color="AAAAAA" w:sz="4"/>
+              <w:left w:val="single" w:color="AAAAAA" w:sz="4"/>
+              <w:bottom w:val="single" w:color="AAAAAA" w:sz="4"/>
+              <w:right w:val="single" w:color="AAAAAA" w:sz="4"/>
             </w:tcBorders>
             <w:tcMar>
               <w:top w:type="dxa" w:w="60"/>
@@ -2490,10 +2490,10 @@
           <w:tcPr>
             <w:tcW w:type="dxa" w:w="900"/>
             <w:tcBorders>
-              <w:top w:val="single" w:color="999999" w:sz="4"/>
-              <w:left w:val="single" w:color="999999" w:sz="4"/>
-              <w:bottom w:val="single" w:color="999999" w:sz="4"/>
-              <w:right w:val="single" w:color="999999" w:sz="4"/>
+              <w:top w:val="single" w:color="AAAAAA" w:sz="4"/>
+              <w:left w:val="single" w:color="AAAAAA" w:sz="4"/>
+              <w:bottom w:val="single" w:color="AAAAAA" w:sz="4"/>
+              <w:right w:val="single" w:color="AAAAAA" w:sz="4"/>
             </w:tcBorders>
             <w:tcMar>
               <w:top w:type="dxa" w:w="60"/>
@@ -2520,10 +2520,10 @@
           <w:tcPr>
             <w:tcW w:type="dxa" w:w="1400"/>
             <w:tcBorders>
-              <w:top w:val="single" w:color="999999" w:sz="4"/>
-              <w:left w:val="single" w:color="999999" w:sz="4"/>
-              <w:bottom w:val="single" w:color="999999" w:sz="4"/>
-              <w:right w:val="single" w:color="999999" w:sz="4"/>
+              <w:top w:val="single" w:color="AAAAAA" w:sz="4"/>
+              <w:left w:val="single" w:color="AAAAAA" w:sz="4"/>
+              <w:bottom w:val="single" w:color="AAAAAA" w:sz="4"/>
+              <w:right w:val="single" w:color="AAAAAA" w:sz="4"/>
             </w:tcBorders>
             <w:tcMar>
               <w:top w:type="dxa" w:w="60"/>
@@ -2550,10 +2550,10 @@
           <w:tcPr>
             <w:tcW w:type="dxa" w:w="1600"/>
             <w:tcBorders>
-              <w:top w:val="single" w:color="999999" w:sz="4"/>
-              <w:left w:val="single" w:color="999999" w:sz="4"/>
-              <w:bottom w:val="single" w:color="999999" w:sz="4"/>
-              <w:right w:val="single" w:color="999999" w:sz="4"/>
+              <w:top w:val="single" w:color="AAAAAA" w:sz="4"/>
+              <w:left w:val="single" w:color="AAAAAA" w:sz="4"/>
+              <w:bottom w:val="single" w:color="AAAAAA" w:sz="4"/>
+              <w:right w:val="single" w:color="AAAAAA" w:sz="4"/>
             </w:tcBorders>
             <w:tcMar>
               <w:top w:type="dxa" w:w="60"/>
@@ -2584,12 +2584,12 @@
           <w:tcPr>
             <w:tcW w:type="dxa" w:w="700"/>
             <w:tcBorders>
-              <w:top w:val="single" w:color="999999" w:sz="4"/>
-              <w:left w:val="single" w:color="999999" w:sz="4"/>
-              <w:bottom w:val="single" w:color="999999" w:sz="4"/>
-              <w:right w:val="single" w:color="999999" w:sz="4"/>
-            </w:tcBorders>
-            <w:shd w:fill="F5F5F5" w:val="clear"/>
+              <w:top w:val="single" w:color="AAAAAA" w:sz="4"/>
+              <w:left w:val="single" w:color="AAAAAA" w:sz="4"/>
+              <w:bottom w:val="single" w:color="AAAAAA" w:sz="4"/>
+              <w:right w:val="single" w:color="AAAAAA" w:sz="4"/>
+            </w:tcBorders>
+            <w:shd w:fill="FAFDF9" w:val="clear"/>
             <w:tcMar>
               <w:top w:type="dxa" w:w="60"/>
               <w:left w:type="dxa" w:w="80"/>
@@ -2615,12 +2615,12 @@
           <w:tcPr>
             <w:tcW w:type="dxa" w:w="3800"/>
             <w:tcBorders>
-              <w:top w:val="single" w:color="999999" w:sz="4"/>
-              <w:left w:val="single" w:color="999999" w:sz="4"/>
-              <w:bottom w:val="single" w:color="999999" w:sz="4"/>
-              <w:right w:val="single" w:color="999999" w:sz="4"/>
-            </w:tcBorders>
-            <w:shd w:fill="F5F5F5" w:val="clear"/>
+              <w:top w:val="single" w:color="AAAAAA" w:sz="4"/>
+              <w:left w:val="single" w:color="AAAAAA" w:sz="4"/>
+              <w:bottom w:val="single" w:color="AAAAAA" w:sz="4"/>
+              <w:right w:val="single" w:color="AAAAAA" w:sz="4"/>
+            </w:tcBorders>
+            <w:shd w:fill="FAFDF9" w:val="clear"/>
             <w:tcMar>
               <w:top w:type="dxa" w:w="60"/>
               <w:left w:type="dxa" w:w="80"/>
@@ -2646,12 +2646,12 @@
           <w:tcPr>
             <w:tcW w:type="dxa" w:w="900"/>
             <w:tcBorders>
-              <w:top w:val="single" w:color="999999" w:sz="4"/>
-              <w:left w:val="single" w:color="999999" w:sz="4"/>
-              <w:bottom w:val="single" w:color="999999" w:sz="4"/>
-              <w:right w:val="single" w:color="999999" w:sz="4"/>
-            </w:tcBorders>
-            <w:shd w:fill="F5F5F5" w:val="clear"/>
+              <w:top w:val="single" w:color="AAAAAA" w:sz="4"/>
+              <w:left w:val="single" w:color="AAAAAA" w:sz="4"/>
+              <w:bottom w:val="single" w:color="AAAAAA" w:sz="4"/>
+              <w:right w:val="single" w:color="AAAAAA" w:sz="4"/>
+            </w:tcBorders>
+            <w:shd w:fill="FAFDF9" w:val="clear"/>
             <w:tcMar>
               <w:top w:type="dxa" w:w="60"/>
               <w:left w:type="dxa" w:w="80"/>
@@ -2677,12 +2677,12 @@
           <w:tcPr>
             <w:tcW w:type="dxa" w:w="900"/>
             <w:tcBorders>
-              <w:top w:val="single" w:color="999999" w:sz="4"/>
-              <w:left w:val="single" w:color="999999" w:sz="4"/>
-              <w:bottom w:val="single" w:color="999999" w:sz="4"/>
-              <w:right w:val="single" w:color="999999" w:sz="4"/>
-            </w:tcBorders>
-            <w:shd w:fill="F5F5F5" w:val="clear"/>
+              <w:top w:val="single" w:color="AAAAAA" w:sz="4"/>
+              <w:left w:val="single" w:color="AAAAAA" w:sz="4"/>
+              <w:bottom w:val="single" w:color="AAAAAA" w:sz="4"/>
+              <w:right w:val="single" w:color="AAAAAA" w:sz="4"/>
+            </w:tcBorders>
+            <w:shd w:fill="FAFDF9" w:val="clear"/>
             <w:tcMar>
               <w:top w:type="dxa" w:w="60"/>
               <w:left w:type="dxa" w:w="80"/>
@@ -2708,12 +2708,12 @@
           <w:tcPr>
             <w:tcW w:type="dxa" w:w="1400"/>
             <w:tcBorders>
-              <w:top w:val="single" w:color="999999" w:sz="4"/>
-              <w:left w:val="single" w:color="999999" w:sz="4"/>
-              <w:bottom w:val="single" w:color="999999" w:sz="4"/>
-              <w:right w:val="single" w:color="999999" w:sz="4"/>
-            </w:tcBorders>
-            <w:shd w:fill="F5F5F5" w:val="clear"/>
+              <w:top w:val="single" w:color="AAAAAA" w:sz="4"/>
+              <w:left w:val="single" w:color="AAAAAA" w:sz="4"/>
+              <w:bottom w:val="single" w:color="AAAAAA" w:sz="4"/>
+              <w:right w:val="single" w:color="AAAAAA" w:sz="4"/>
+            </w:tcBorders>
+            <w:shd w:fill="FAFDF9" w:val="clear"/>
             <w:tcMar>
               <w:top w:type="dxa" w:w="60"/>
               <w:left w:type="dxa" w:w="80"/>
@@ -2739,12 +2739,12 @@
           <w:tcPr>
             <w:tcW w:type="dxa" w:w="1600"/>
             <w:tcBorders>
-              <w:top w:val="single" w:color="999999" w:sz="4"/>
-              <w:left w:val="single" w:color="999999" w:sz="4"/>
-              <w:bottom w:val="single" w:color="999999" w:sz="4"/>
-              <w:right w:val="single" w:color="999999" w:sz="4"/>
-            </w:tcBorders>
-            <w:shd w:fill="F5F5F5" w:val="clear"/>
+              <w:top w:val="single" w:color="AAAAAA" w:sz="4"/>
+              <w:left w:val="single" w:color="AAAAAA" w:sz="4"/>
+              <w:bottom w:val="single" w:color="AAAAAA" w:sz="4"/>
+              <w:right w:val="single" w:color="AAAAAA" w:sz="4"/>
+            </w:tcBorders>
+            <w:shd w:fill="FAFDF9" w:val="clear"/>
             <w:tcMar>
               <w:top w:type="dxa" w:w="60"/>
               <w:left w:type="dxa" w:w="80"/>
@@ -2774,10 +2774,10 @@
           <w:tcPr>
             <w:tcW w:type="dxa" w:w="700"/>
             <w:tcBorders>
-              <w:top w:val="single" w:color="999999" w:sz="4"/>
-              <w:left w:val="single" w:color="999999" w:sz="4"/>
-              <w:bottom w:val="single" w:color="999999" w:sz="4"/>
-              <w:right w:val="single" w:color="999999" w:sz="4"/>
+              <w:top w:val="single" w:color="AAAAAA" w:sz="4"/>
+              <w:left w:val="single" w:color="AAAAAA" w:sz="4"/>
+              <w:bottom w:val="single" w:color="AAAAAA" w:sz="4"/>
+              <w:right w:val="single" w:color="AAAAAA" w:sz="4"/>
             </w:tcBorders>
             <w:tcMar>
               <w:top w:type="dxa" w:w="60"/>
@@ -2804,10 +2804,10 @@
           <w:tcPr>
             <w:tcW w:type="dxa" w:w="3800"/>
             <w:tcBorders>
-              <w:top w:val="single" w:color="999999" w:sz="4"/>
-              <w:left w:val="single" w:color="999999" w:sz="4"/>
-              <w:bottom w:val="single" w:color="999999" w:sz="4"/>
-              <w:right w:val="single" w:color="999999" w:sz="4"/>
+              <w:top w:val="single" w:color="AAAAAA" w:sz="4"/>
+              <w:left w:val="single" w:color="AAAAAA" w:sz="4"/>
+              <w:bottom w:val="single" w:color="AAAAAA" w:sz="4"/>
+              <w:right w:val="single" w:color="AAAAAA" w:sz="4"/>
             </w:tcBorders>
             <w:tcMar>
               <w:top w:type="dxa" w:w="60"/>
@@ -2834,10 +2834,10 @@
           <w:tcPr>
             <w:tcW w:type="dxa" w:w="900"/>
             <w:tcBorders>
-              <w:top w:val="single" w:color="999999" w:sz="4"/>
-              <w:left w:val="single" w:color="999999" w:sz="4"/>
-              <w:bottom w:val="single" w:color="999999" w:sz="4"/>
-              <w:right w:val="single" w:color="999999" w:sz="4"/>
+              <w:top w:val="single" w:color="AAAAAA" w:sz="4"/>
+              <w:left w:val="single" w:color="AAAAAA" w:sz="4"/>
+              <w:bottom w:val="single" w:color="AAAAAA" w:sz="4"/>
+              <w:right w:val="single" w:color="AAAAAA" w:sz="4"/>
             </w:tcBorders>
             <w:tcMar>
               <w:top w:type="dxa" w:w="60"/>
@@ -2864,10 +2864,10 @@
           <w:tcPr>
             <w:tcW w:type="dxa" w:w="900"/>
             <w:tcBorders>
-              <w:top w:val="single" w:color="999999" w:sz="4"/>
-              <w:left w:val="single" w:color="999999" w:sz="4"/>
-              <w:bottom w:val="single" w:color="999999" w:sz="4"/>
-              <w:right w:val="single" w:color="999999" w:sz="4"/>
+              <w:top w:val="single" w:color="AAAAAA" w:sz="4"/>
+              <w:left w:val="single" w:color="AAAAAA" w:sz="4"/>
+              <w:bottom w:val="single" w:color="AAAAAA" w:sz="4"/>
+              <w:right w:val="single" w:color="AAAAAA" w:sz="4"/>
             </w:tcBorders>
             <w:tcMar>
               <w:top w:type="dxa" w:w="60"/>
@@ -2894,10 +2894,10 @@
           <w:tcPr>
             <w:tcW w:type="dxa" w:w="1400"/>
             <w:tcBorders>
-              <w:top w:val="single" w:color="999999" w:sz="4"/>
-              <w:left w:val="single" w:color="999999" w:sz="4"/>
-              <w:bottom w:val="single" w:color="999999" w:sz="4"/>
-              <w:right w:val="single" w:color="999999" w:sz="4"/>
+              <w:top w:val="single" w:color="AAAAAA" w:sz="4"/>
+              <w:left w:val="single" w:color="AAAAAA" w:sz="4"/>
+              <w:bottom w:val="single" w:color="AAAAAA" w:sz="4"/>
+              <w:right w:val="single" w:color="AAAAAA" w:sz="4"/>
             </w:tcBorders>
             <w:tcMar>
               <w:top w:type="dxa" w:w="60"/>
@@ -2924,10 +2924,10 @@
           <w:tcPr>
             <w:tcW w:type="dxa" w:w="1600"/>
             <w:tcBorders>
-              <w:top w:val="single" w:color="999999" w:sz="4"/>
-              <w:left w:val="single" w:color="999999" w:sz="4"/>
-              <w:bottom w:val="single" w:color="999999" w:sz="4"/>
-              <w:right w:val="single" w:color="999999" w:sz="4"/>
+              <w:top w:val="single" w:color="AAAAAA" w:sz="4"/>
+              <w:left w:val="single" w:color="AAAAAA" w:sz="4"/>
+              <w:bottom w:val="single" w:color="AAAAAA" w:sz="4"/>
+              <w:right w:val="single" w:color="AAAAAA" w:sz="4"/>
             </w:tcBorders>
             <w:tcMar>
               <w:top w:type="dxa" w:w="60"/>

</xml_diff>